<commit_message>
feat: adiciona contrato de servicos e aprimora emissao de locacao
</commit_message>
<xml_diff>
--- a/resources/documents/contracts/property-lease.docx
+++ b/resources/documents/contracts/property-lease.docx
@@ -9,40 +9,94 @@
           <w:rFonts w:ascii="Arial" w:hAnsi="Arial" w:cs="Arial"/>
           <w:b/>
           <w:color w:val="000000"/>
-        </w:rPr>
-      </w:pPr>
-      <w:r>
-        <w:rPr>
-          <w:rFonts w:ascii="Arial" w:hAnsi="Arial" w:cs="Arial"/>
+          <w:sz w:val="20"/>
+          <w:szCs w:val="20"/>
+        </w:rPr>
+      </w:pPr>
+    </w:p>
+    <w:p>
+      <w:pPr>
+        <w:ind w:left="3686"/>
+        <w:rPr>
+          <w:rFonts w:ascii="Arial" w:hAnsi="Arial" w:cs="Arial"/>
+          <w:bCs/>
+          <w:sz w:val="20"/>
+          <w:szCs w:val="20"/>
+        </w:rPr>
+        <w:jc w:val="center"/>
+      </w:pPr>
+      <w:r>
+        <w:rPr>
+          <w:rFonts w:ascii="Arial" w:hAnsi="Arial" w:cs="Arial"/>
+          <w:bCs/>
+          <w:sz w:val="20"/>
+          <w:szCs w:val="20"/>
           <w:b/>
-          <w:color w:val="000000"/>
-        </w:rPr>
-        <w:t xml:space="preserve">CONTRATO Nº </w:t>
-      </w:r>
-      <w:r>
-        <w:rPr>
-          <w:rFonts w:ascii="Arial" w:hAnsi="Arial" w:cs="Arial"/>
+        </w:rPr>
+        <w:t>CONTRATO DE LOCAÇÃO DE IMÓVEL Nº #Contrato</w:t>
+      </w:r>
+    </w:p>
+    <w:p>
+      <w:pPr>
+        <w:jc w:val="both"/>
+        <w:rPr>
+          <w:rFonts w:ascii="Arial" w:hAnsi="Arial" w:cs="Arial"/>
+          <w:bCs/>
+          <w:sz w:val="20"/>
+          <w:szCs w:val="20"/>
+        </w:rPr>
+      </w:pPr>
+    </w:p>
+    <w:p>
+      <w:pPr>
+        <w:ind w:left="70"/>
+        <w:jc w:val="both"/>
+        <w:rPr>
+          <w:rFonts w:ascii="Arial" w:hAnsi="Arial" w:cs="Arial"/>
+          <w:sz w:val="20"/>
+          <w:szCs w:val="20"/>
+        </w:rPr>
+      </w:pPr>
+      <w:r>
+        <w:rPr>
+          <w:rFonts w:ascii="Arial" w:hAnsi="Arial" w:cs="Arial"/>
+          <w:sz w:val="20"/>
+          <w:szCs w:val="20"/>
           <w:b/>
-          <w:color w:val="000000"/>
-        </w:rPr>
-        <w:t>#Contrato</w:t>
-      </w:r>
-    </w:p>
-    <w:p>
-      <w:pPr>
-        <w:jc w:val="center"/>
-        <w:rPr>
-          <w:rFonts w:ascii="Arial" w:hAnsi="Arial" w:cs="Arial"/>
+        </w:rPr>
+        <w:t xml:space="preserve">Processo:</w:t>
+      </w:r>
+      <w:r>
+        <w:rPr>
+          <w:rFonts w:ascii="Arial" w:hAnsi="Arial" w:cs="Arial"/>
+          <w:sz w:val="20"/>
+          <w:szCs w:val="20"/>
+        </w:rPr>
+        <w:t xml:space="preserve"> #Processo</w:t>
+      </w:r>
+      <w:r>
+        <w:br/>
+      </w:r>
+      <w:r>
+        <w:rPr>
+          <w:rFonts w:ascii="Arial" w:hAnsi="Arial" w:cs="Arial"/>
+          <w:sz w:val="20"/>
+          <w:szCs w:val="20"/>
           <w:b/>
-          <w:color w:val="000000"/>
-          <w:sz w:val="20"/>
-          <w:szCs w:val="20"/>
-        </w:rPr>
-      </w:pPr>
-    </w:p>
-    <w:p>
-      <w:pPr>
-        <w:ind w:left="3686"/>
+        </w:rPr>
+        <w:t xml:space="preserve">#Modalidade</w:t>
+      </w:r>
+      <w:r>
+        <w:rPr>
+          <w:rFonts w:ascii="Arial" w:hAnsi="Arial" w:cs="Arial"/>
+          <w:sz w:val="20"/>
+          <w:szCs w:val="20"/>
+        </w:rPr>
+        <w:t xml:space="preserve"> nº. #N_Modalidade</w:t>
+      </w:r>
+    </w:p>
+    <w:p>
+      <w:pPr>
         <w:jc w:val="both"/>
         <w:rPr>
           <w:rFonts w:ascii="Arial" w:hAnsi="Arial" w:cs="Arial"/>
@@ -51,6 +105,16 @@
           <w:szCs w:val="20"/>
         </w:rPr>
       </w:pPr>
+    </w:p>
+    <w:p>
+      <w:pPr>
+        <w:jc w:val="both"/>
+        <w:rPr>
+          <w:rFonts w:ascii="Arial" w:eastAsia="Arial" w:hAnsi="Arial" w:cs="Arial"/>
+          <w:sz w:val="20"/>
+          <w:szCs w:val="20"/>
+        </w:rPr>
+      </w:pPr>
       <w:r>
         <w:rPr>
           <w:rFonts w:ascii="Arial" w:hAnsi="Arial" w:cs="Arial"/>
@@ -58,25 +122,7 @@
           <w:sz w:val="20"/>
           <w:szCs w:val="20"/>
         </w:rPr>
-        <w:t xml:space="preserve">CONTRATO ADMINISTRATIVO Nº </w:t>
-      </w:r>
-      <w:r>
-        <w:rPr>
-          <w:rFonts w:ascii="Arial" w:hAnsi="Arial" w:cs="Arial"/>
-          <w:bCs/>
-          <w:sz w:val="20"/>
-          <w:szCs w:val="20"/>
-        </w:rPr>
-        <w:t>#Contrato</w:t>
-      </w:r>
-      <w:r>
-        <w:rPr>
-          <w:rFonts w:ascii="Arial" w:hAnsi="Arial" w:cs="Arial"/>
-          <w:bCs/>
-          <w:sz w:val="20"/>
-          <w:szCs w:val="20"/>
-        </w:rPr>
-        <w:t xml:space="preserve">, DE LOCAÇÃO DE IMÓVEL, QUE ENTRE SI CELEBRAM O </w:t>
+        <w:t xml:space="preserve"/>
       </w:r>
       <w:r>
         <w:rPr>
@@ -85,16 +131,23 @@
           <w:sz w:val="20"/>
           <w:szCs w:val="20"/>
         </w:rPr>
-        <w:t>MUNICÍPIO DE NIQUELÂNDIA</w:t>
-      </w:r>
-      <w:r>
-        <w:rPr>
-          <w:rFonts w:ascii="Arial" w:hAnsi="Arial" w:cs="Arial"/>
-          <w:bCs/>
-          <w:sz w:val="20"/>
-          <w:szCs w:val="20"/>
-        </w:rPr>
-        <w:t xml:space="preserve">, POR INTERMÉDIO DO </w:t>
+        <w:t/>
+      </w:r>
+      <w:r>
+        <w:rPr>
+          <w:rFonts w:ascii="Arial" w:hAnsi="Arial" w:cs="Arial"/>
+          <w:sz w:val="20"/>
+          <w:szCs w:val="20"/>
+        </w:rPr>
+        <w:t xml:space="preserve"/>
+      </w:r>
+      <w:r>
+        <w:rPr>
+          <w:rFonts w:ascii="Arial" w:hAnsi="Arial" w:cs="Arial"/>
+          <w:sz w:val="20"/>
+          <w:szCs w:val="20"/>
+        </w:rPr>
+        <w:t xml:space="preserve">O </w:t>
       </w:r>
       <w:r>
         <w:rPr>
@@ -103,165 +156,7 @@
           <w:sz w:val="20"/>
           <w:szCs w:val="20"/>
         </w:rPr>
-        <w:t>#FUNDO</w:t>
-      </w:r>
-      <w:r>
-        <w:rPr>
-          <w:rFonts w:ascii="Arial" w:hAnsi="Arial" w:cs="Arial"/>
-          <w:bCs/>
-          <w:sz w:val="20"/>
-          <w:szCs w:val="20"/>
-        </w:rPr>
-        <w:t xml:space="preserve">, </w:t>
-      </w:r>
-      <w:r>
-        <w:rPr>
-          <w:rFonts w:ascii="Arial" w:hAnsi="Arial" w:cs="Arial"/>
-          <w:bCs/>
-          <w:sz w:val="20"/>
-          <w:szCs w:val="20"/>
-        </w:rPr>
-        <w:t xml:space="preserve">E </w:t>
-      </w:r>
-      <w:r>
-        <w:rPr>
-          <w:rFonts w:ascii="Arial" w:hAnsi="Arial" w:cs="Arial"/>
-          <w:sz w:val="20"/>
-          <w:szCs w:val="20"/>
-        </w:rPr>
-        <w:t>#</w:t>
-      </w:r>
-      <w:r>
-        <w:rPr>
-          <w:rFonts w:ascii="Arial" w:hAnsi="Arial" w:cs="Arial"/>
-          <w:bCs/>
-          <w:sz w:val="20"/>
-          <w:szCs w:val="20"/>
-        </w:rPr>
-        <w:t xml:space="preserve">PF_PJ </w:t>
-      </w:r>
-      <w:r>
-        <w:rPr>
-          <w:rFonts w:ascii="Arial" w:hAnsi="Arial" w:cs="Arial"/>
-          <w:b/>
-          <w:sz w:val="20"/>
-          <w:szCs w:val="20"/>
-        </w:rPr>
-        <w:t>#NomeLocador</w:t>
-      </w:r>
-      <w:r>
-        <w:rPr>
-          <w:rFonts w:ascii="Arial" w:hAnsi="Arial" w:cs="Arial"/>
-          <w:bCs/>
-          <w:sz w:val="20"/>
-          <w:szCs w:val="20"/>
-        </w:rPr>
-        <w:t>, NOS TERMOS ABAIXO ADUZIDOS.</w:t>
-      </w:r>
-    </w:p>
-    <w:p>
-      <w:pPr>
-        <w:jc w:val="both"/>
-        <w:rPr>
-          <w:rFonts w:ascii="Arial" w:hAnsi="Arial" w:cs="Arial"/>
-          <w:bCs/>
-          <w:sz w:val="20"/>
-          <w:szCs w:val="20"/>
-        </w:rPr>
-      </w:pPr>
-    </w:p>
-    <w:p>
-      <w:pPr>
-        <w:ind w:left="70"/>
-        <w:jc w:val="both"/>
-        <w:rPr>
-          <w:rFonts w:ascii="Arial" w:hAnsi="Arial" w:cs="Arial"/>
-          <w:sz w:val="20"/>
-          <w:szCs w:val="20"/>
-        </w:rPr>
-      </w:pPr>
-      <w:r>
-        <w:rPr>
-          <w:rFonts w:ascii="Arial" w:hAnsi="Arial" w:cs="Arial"/>
-          <w:sz w:val="20"/>
-          <w:szCs w:val="20"/>
-        </w:rPr>
-        <w:t>Processo: #Processo</w:t>
-      </w:r>
-    </w:p>
-    <w:p>
-      <w:pPr>
-        <w:ind w:left="70"/>
-        <w:jc w:val="both"/>
-        <w:rPr>
-          <w:rFonts w:ascii="Arial" w:hAnsi="Arial" w:cs="Arial"/>
-          <w:sz w:val="20"/>
-          <w:szCs w:val="20"/>
-        </w:rPr>
-      </w:pPr>
-      <w:r>
-        <w:rPr>
-          <w:rFonts w:ascii="Arial" w:hAnsi="Arial" w:cs="Arial"/>
-          <w:sz w:val="20"/>
-          <w:szCs w:val="20"/>
-        </w:rPr>
-        <w:t>#Modalidade nº. #N_Modalidade</w:t>
-      </w:r>
-    </w:p>
-    <w:p>
-      <w:pPr>
-        <w:jc w:val="both"/>
-        <w:rPr>
-          <w:rFonts w:ascii="Arial" w:hAnsi="Arial" w:cs="Arial"/>
-          <w:bCs/>
-          <w:sz w:val="20"/>
-          <w:szCs w:val="20"/>
-        </w:rPr>
-      </w:pPr>
-    </w:p>
-    <w:p>
-      <w:pPr>
-        <w:jc w:val="both"/>
-        <w:rPr>
-          <w:rFonts w:ascii="Arial" w:eastAsia="Arial" w:hAnsi="Arial" w:cs="Arial"/>
-          <w:sz w:val="20"/>
-          <w:szCs w:val="20"/>
-        </w:rPr>
-      </w:pPr>
-      <w:r>
-        <w:rPr>
-          <w:rFonts w:ascii="Arial" w:hAnsi="Arial" w:cs="Arial"/>
-          <w:bCs/>
-          <w:sz w:val="20"/>
-          <w:szCs w:val="20"/>
-        </w:rPr>
-        <w:t xml:space="preserve">O </w:t>
-      </w:r>
-      <w:r>
-        <w:rPr>
-          <w:rFonts w:ascii="Arial" w:hAnsi="Arial" w:cs="Arial"/>
-          <w:b/>
-          <w:sz w:val="20"/>
-          <w:szCs w:val="20"/>
-        </w:rPr>
-        <w:t>MUNICÍPIO DE NIQUELÂNDIA-GO</w:t>
-      </w:r>
-      <w:r>
-        <w:rPr>
-          <w:rFonts w:ascii="Arial" w:hAnsi="Arial" w:cs="Arial"/>
-          <w:sz w:val="20"/>
-          <w:szCs w:val="20"/>
-        </w:rPr>
-        <w:t xml:space="preserve">, por intermédio do </w:t>
-      </w:r>
-      <w:r>
-        <w:rPr>
-          <w:rFonts w:ascii="Arial" w:hAnsi="Arial" w:cs="Arial"/>
-          <w:b/>
-          <w:sz w:val="20"/>
-          <w:szCs w:val="20"/>
-        </w:rPr>
-        <w:t>#FUNDO</w:t>
+        <w:t xml:space="preserve">#FUNDO</w:t>
       </w:r>
       <w:r>
         <w:rPr>
@@ -463,12 +358,12 @@
       <w:r>
         <w:rPr>
           <w:rFonts w:ascii="Arial" w:eastAsia="Arial" w:hAnsi="Arial" w:cs="Arial"/>
+          <w:bCs/>
+          <w:sz w:val="20"/>
+          <w:szCs w:val="20"/>
           <w:b/>
-          <w:bCs/>
-          <w:sz w:val="20"/>
-          <w:szCs w:val="20"/>
-        </w:rPr>
-        <w:t>LOCATÁRIO</w:t>
+        </w:rPr>
+        <w:t xml:space="preserve">LOCATÁRIO</w:t>
       </w:r>
       <w:r>
         <w:rPr>
@@ -523,12 +418,12 @@
       <w:r>
         <w:rPr>
           <w:rFonts w:ascii="Arial" w:eastAsia="Arial" w:hAnsi="Arial" w:cs="Arial"/>
+          <w:bCs/>
+          <w:sz w:val="20"/>
+          <w:szCs w:val="20"/>
           <w:b/>
-          <w:bCs/>
-          <w:sz w:val="20"/>
-          <w:szCs w:val="20"/>
-        </w:rPr>
-        <w:t>LOCADOR</w:t>
+        </w:rPr>
+        <w:t xml:space="preserve">LOCADOR</w:t>
       </w:r>
       <w:r>
         <w:rPr>
@@ -1671,7 +1566,16 @@
           <w:sz w:val="20"/>
           <w:szCs w:val="20"/>
         </w:rPr>
-        <w:t>CLÁUSULA SEGUNDA – DOS DEVERES E RESPONSABILIDADES DO LOCADOR</w:t>
+        <w:t xml:space="preserve">CLÁUSULA SEGUNDA – DOS DEVERES E RESPONSABILIDADES DO </w:t>
+      </w:r>
+      <w:r>
+        <w:rPr>
+          <w:rFonts w:ascii="Arial" w:hAnsi="Arial" w:cs="Arial"/>
+          <w:sz w:val="20"/>
+          <w:szCs w:val="20"/>
+          <w:b/>
+        </w:rPr>
+        <w:t xml:space="preserve">LOCADOR</w:t>
       </w:r>
     </w:p>
     <w:p>
@@ -1715,11 +1619,11 @@
       <w:r>
         <w:rPr>
           <w:rFonts w:ascii="Arial" w:hAnsi="Arial" w:cs="Arial"/>
+          <w:sz w:val="20"/>
+          <w:szCs w:val="20"/>
           <w:b/>
-          <w:sz w:val="20"/>
-          <w:szCs w:val="20"/>
-        </w:rPr>
-        <w:t>LOCADOR</w:t>
+        </w:rPr>
+        <w:t xml:space="preserve">LOCADOR</w:t>
       </w:r>
       <w:r>
         <w:rPr>
@@ -1808,7 +1712,24 @@
           <w:sz w:val="20"/>
           <w:szCs w:val="20"/>
         </w:rPr>
-        <w:t xml:space="preserve">Realizar, junto com o LOCATÁRIO, a vistoria do imóvel por ocasião da entrega das chaves, para fins de verificação minuciosa do seu estado, fazendo constar no Termo de Vistoria, parte integrante deste contrato, os eventuais defeitos existentes; </w:t>
+        <w:t xml:space="preserve">Realizar, junto com o </w:t>
+      </w:r>
+      <w:r>
+        <w:rPr>
+          <w:rFonts w:ascii="Arial" w:hAnsi="Arial" w:cs="Arial"/>
+          <w:sz w:val="20"/>
+          <w:szCs w:val="20"/>
+          <w:b/>
+        </w:rPr>
+        <w:t xml:space="preserve">LOCATÁRIO</w:t>
+      </w:r>
+      <w:r>
+        <w:rPr>
+          <w:rFonts w:ascii="Arial" w:hAnsi="Arial" w:cs="Arial"/>
+          <w:sz w:val="20"/>
+          <w:szCs w:val="20"/>
+        </w:rPr>
+        <w:t xml:space="preserve">, a vistoria do imóvel por ocasião da entrega das chaves, para fins de verificação minuciosa do seu estado, fazendo constar no Termo de Vistoria, parte integrante deste contrato, os eventuais defeitos existentes; </w:t>
       </w:r>
     </w:p>
     <w:p>
@@ -1836,7 +1757,24 @@
           <w:sz w:val="20"/>
           <w:szCs w:val="20"/>
         </w:rPr>
-        <w:t xml:space="preserve">Responder pelos danos ao patrimônio do LOCATÁRIO decorrentes de seus atos, bem como de vícios e defeitos anteriores à locação, como desabamentos decorrentes de vícios redibitórios, incêndios provenientes de vícios pré-existentes na instalação </w:t>
+        <w:t xml:space="preserve">Responder pelos danos ao patrimônio do </w:t>
+      </w:r>
+      <w:r>
+        <w:rPr>
+          <w:rFonts w:ascii="Arial" w:hAnsi="Arial" w:cs="Arial"/>
+          <w:sz w:val="20"/>
+          <w:szCs w:val="20"/>
+          <w:b/>
+        </w:rPr>
+        <w:t xml:space="preserve">LOCATÁRIO</w:t>
+      </w:r>
+      <w:r>
+        <w:rPr>
+          <w:rFonts w:ascii="Arial" w:hAnsi="Arial" w:cs="Arial"/>
+          <w:sz w:val="20"/>
+          <w:szCs w:val="20"/>
+        </w:rPr>
+        <w:t xml:space="preserve"> decorrentes de seus atos, bem como de vícios e defeitos anteriores à locação, como desabamentos decorrentes de vícios redibitórios, incêndios provenientes de vícios pré-existentes na instalação </w:t>
       </w:r>
       <w:r>
         <w:rPr>
@@ -1941,7 +1879,24 @@
           <w:sz w:val="20"/>
           <w:szCs w:val="20"/>
         </w:rPr>
-        <w:t>Fornecer ao LOCATÁRIO recibo discriminando as importâncias pagas, vedada a quitação genérica;</w:t>
+        <w:t xml:space="preserve">Fornecer ao </w:t>
+      </w:r>
+      <w:r>
+        <w:rPr>
+          <w:rFonts w:ascii="Arial" w:hAnsi="Arial" w:cs="Arial"/>
+          <w:sz w:val="20"/>
+          <w:szCs w:val="20"/>
+          <w:b/>
+        </w:rPr>
+        <w:t xml:space="preserve">LOCATÁRIO</w:t>
+      </w:r>
+      <w:r>
+        <w:rPr>
+          <w:rFonts w:ascii="Arial" w:hAnsi="Arial" w:cs="Arial"/>
+          <w:sz w:val="20"/>
+          <w:szCs w:val="20"/>
+        </w:rPr>
+        <w:t xml:space="preserve"> recibo discriminando as importâncias pagas, vedada a quitação genérica;</w:t>
       </w:r>
     </w:p>
     <w:p>
@@ -2022,7 +1977,24 @@
           <w:sz w:val="20"/>
           <w:szCs w:val="20"/>
         </w:rPr>
-        <w:t xml:space="preserve">Notificar o LOCATÁRIO, com antecedência mínima de 90 (noventa) dias do término da vigência do contrato, quando não houver interesse em prorrogar a locação; </w:t>
+        <w:t xml:space="preserve">Notificar o </w:t>
+      </w:r>
+      <w:r>
+        <w:rPr>
+          <w:rFonts w:ascii="Arial" w:hAnsi="Arial" w:cs="Arial"/>
+          <w:sz w:val="20"/>
+          <w:szCs w:val="20"/>
+          <w:b/>
+        </w:rPr>
+        <w:t xml:space="preserve">LOCATÁRIO</w:t>
+      </w:r>
+      <w:r>
+        <w:rPr>
+          <w:rFonts w:ascii="Arial" w:hAnsi="Arial" w:cs="Arial"/>
+          <w:sz w:val="20"/>
+          <w:szCs w:val="20"/>
+        </w:rPr>
+        <w:t xml:space="preserve">, com antecedência mínima de 90 (noventa) dias do término da vigência do contrato, quando não houver interesse em prorrogar a locação; </w:t>
       </w:r>
     </w:p>
     <w:p>
@@ -2049,7 +2021,24 @@
           <w:sz w:val="20"/>
           <w:szCs w:val="20"/>
         </w:rPr>
-        <w:t>Informar ao LOCATÁRIO quaisquer alterações na titularidade do imóvel, inclusive com a apresentação da documentação correspondente.</w:t>
+        <w:t xml:space="preserve">Informar ao </w:t>
+      </w:r>
+      <w:r>
+        <w:rPr>
+          <w:rFonts w:ascii="Arial" w:hAnsi="Arial" w:cs="Arial"/>
+          <w:sz w:val="20"/>
+          <w:szCs w:val="20"/>
+          <w:b/>
+        </w:rPr>
+        <w:t xml:space="preserve">LOCATÁRIO</w:t>
+      </w:r>
+      <w:r>
+        <w:rPr>
+          <w:rFonts w:ascii="Arial" w:hAnsi="Arial" w:cs="Arial"/>
+          <w:sz w:val="20"/>
+          <w:szCs w:val="20"/>
+        </w:rPr>
+        <w:t xml:space="preserve"> quaisquer alterações na titularidade do imóvel, inclusive com a apresentação da documentação correspondente.</w:t>
       </w:r>
     </w:p>
     <w:p>
@@ -2080,7 +2069,25 @@
           <w:sz w:val="20"/>
           <w:szCs w:val="20"/>
         </w:rPr>
-        <w:t>CLÁUSULA TERCEIRA – DOS DEVERES E RESPONSABILIDADES DO LOCATÁRIO.</w:t>
+        <w:t xml:space="preserve">CLÁUSULA TERCEIRA – DOS DEVERES E RESPONSABILIDADES DO </w:t>
+      </w:r>
+      <w:r>
+        <w:rPr>
+          <w:rFonts w:ascii="Arial" w:hAnsi="Arial" w:cs="Arial"/>
+          <w:sz w:val="20"/>
+          <w:szCs w:val="20"/>
+          <w:b/>
+        </w:rPr>
+        <w:t xml:space="preserve">LOCATÁRIO</w:t>
+      </w:r>
+      <w:r>
+        <w:rPr>
+          <w:rFonts w:ascii="Arial" w:hAnsi="Arial" w:cs="Arial"/>
+          <w:b/>
+          <w:sz w:val="20"/>
+          <w:szCs w:val="20"/>
+        </w:rPr>
+        <w:t xml:space="preserve">.</w:t>
       </w:r>
     </w:p>
     <w:p>
@@ -2130,11 +2137,11 @@
       <w:r>
         <w:rPr>
           <w:rFonts w:ascii="Arial" w:hAnsi="Arial" w:cs="Arial"/>
+          <w:sz w:val="20"/>
+          <w:szCs w:val="20"/>
           <w:b/>
-          <w:sz w:val="20"/>
-          <w:szCs w:val="20"/>
-        </w:rPr>
-        <w:t>LOCATÁRIO</w:t>
+        </w:rPr>
+        <w:t xml:space="preserve">LOCATÁRIO</w:t>
       </w:r>
       <w:r>
         <w:rPr>
@@ -2248,7 +2255,24 @@
           <w:sz w:val="20"/>
           <w:szCs w:val="20"/>
         </w:rPr>
-        <w:t xml:space="preserve">Realizar, junto com o LOCADOR a vistoria do imóvel, por ocasião da entrega das chaves, para fins de verificação minuciosa do estado do imóvel, </w:t>
+        <w:t xml:space="preserve">Realizar, junto com o </w:t>
+      </w:r>
+      <w:r>
+        <w:rPr>
+          <w:rFonts w:ascii="Arial" w:hAnsi="Arial" w:cs="Arial"/>
+          <w:sz w:val="20"/>
+          <w:szCs w:val="20"/>
+          <w:b/>
+        </w:rPr>
+        <w:t xml:space="preserve">LOCADOR</w:t>
+      </w:r>
+      <w:r>
+        <w:rPr>
+          <w:rFonts w:ascii="Arial" w:hAnsi="Arial" w:cs="Arial"/>
+          <w:sz w:val="20"/>
+          <w:szCs w:val="20"/>
+        </w:rPr>
+        <w:t xml:space="preserve"> a vistoria do imóvel, por ocasião da entrega das chaves, para fins de verificação minuciosa do estado do imóvel, </w:t>
       </w:r>
       <w:r>
         <w:rPr>
@@ -2257,7 +2281,26 @@
           <w:sz w:val="20"/>
           <w:szCs w:val="20"/>
         </w:rPr>
-        <w:t>fazendo constar no Termo de Vistoria fornecido pelo LOCADOR os eventuais defeitos existentes;</w:t>
+        <w:t xml:space="preserve">fazendo constar no Termo de Vistoria fornecido pelo </w:t>
+      </w:r>
+      <w:r>
+        <w:rPr>
+          <w:rFonts w:ascii="Arial" w:hAnsi="Arial" w:cs="Arial"/>
+          <w:bCs/>
+          <w:sz w:val="20"/>
+          <w:szCs w:val="20"/>
+          <w:b/>
+        </w:rPr>
+        <w:t xml:space="preserve">LOCADOR</w:t>
+      </w:r>
+      <w:r>
+        <w:rPr>
+          <w:rFonts w:ascii="Arial" w:hAnsi="Arial" w:cs="Arial"/>
+          <w:bCs/>
+          <w:sz w:val="20"/>
+          <w:szCs w:val="20"/>
+        </w:rPr>
+        <w:t xml:space="preserve"> os eventuais defeitos existentes;</w:t>
       </w:r>
     </w:p>
     <w:p>
@@ -2362,7 +2405,24 @@
           <w:sz w:val="20"/>
           <w:szCs w:val="20"/>
         </w:rPr>
-        <w:t>Comunicar ao LOCADOR qualquer dano ou defeito cuja reparação a este incumba, bem como as eventuais turbações de terceiros;</w:t>
+        <w:t xml:space="preserve">Comunicar ao </w:t>
+      </w:r>
+      <w:r>
+        <w:rPr>
+          <w:rFonts w:ascii="Arial" w:hAnsi="Arial" w:cs="Arial"/>
+          <w:sz w:val="20"/>
+          <w:szCs w:val="20"/>
+          <w:b/>
+        </w:rPr>
+        <w:t xml:space="preserve">LOCADOR</w:t>
+      </w:r>
+      <w:r>
+        <w:rPr>
+          <w:rFonts w:ascii="Arial" w:hAnsi="Arial" w:cs="Arial"/>
+          <w:sz w:val="20"/>
+          <w:szCs w:val="20"/>
+        </w:rPr>
+        <w:t xml:space="preserve"> qualquer dano ou defeito cuja reparação a este incumba, bem como as eventuais turbações de terceiros;</w:t>
       </w:r>
     </w:p>
     <w:p>
@@ -2397,7 +2457,24 @@
           <w:sz w:val="20"/>
           <w:szCs w:val="20"/>
         </w:rPr>
-        <w:t>Consentir com a realização de reparos urgentes, a cargo do LOCADOR, assegurando-se o direito ao abatimento proporcional do aluguel, caso os reparos durem mais de dez dias, nos termos do artigo 26 da Lei n° 8.245, de 1991;</w:t>
+        <w:t xml:space="preserve">Consentir com a realização de reparos urgentes, a cargo do </w:t>
+      </w:r>
+      <w:r>
+        <w:rPr>
+          <w:rFonts w:ascii="Arial" w:hAnsi="Arial" w:cs="Arial"/>
+          <w:sz w:val="20"/>
+          <w:szCs w:val="20"/>
+          <w:b/>
+        </w:rPr>
+        <w:t xml:space="preserve">LOCADOR</w:t>
+      </w:r>
+      <w:r>
+        <w:rPr>
+          <w:rFonts w:ascii="Arial" w:hAnsi="Arial" w:cs="Arial"/>
+          <w:sz w:val="20"/>
+          <w:szCs w:val="20"/>
+        </w:rPr>
+        <w:t xml:space="preserve">, assegurando-se o direito ao abatimento proporcional do aluguel, caso os reparos durem mais de dez dias, nos termos do artigo 26 da Lei n° 8.245, de 1991;</w:t>
       </w:r>
     </w:p>
     <w:p>
@@ -2432,7 +2509,24 @@
           <w:sz w:val="20"/>
           <w:szCs w:val="20"/>
         </w:rPr>
-        <w:t>Não modificar a forma externa ou interna do imóvel, sem o consentimento prévio e por escrito do LOCADOR;</w:t>
+        <w:t xml:space="preserve">Não modificar a forma externa ou interna do imóvel, sem o consentimento prévio e por escrito do </w:t>
+      </w:r>
+      <w:r>
+        <w:rPr>
+          <w:rFonts w:ascii="Arial" w:hAnsi="Arial" w:cs="Arial"/>
+          <w:sz w:val="20"/>
+          <w:szCs w:val="20"/>
+          <w:b/>
+        </w:rPr>
+        <w:t xml:space="preserve">LOCADOR</w:t>
+      </w:r>
+      <w:r>
+        <w:rPr>
+          <w:rFonts w:ascii="Arial" w:hAnsi="Arial" w:cs="Arial"/>
+          <w:sz w:val="20"/>
+          <w:szCs w:val="20"/>
+        </w:rPr>
+        <w:t xml:space="preserve">;</w:t>
       </w:r>
     </w:p>
     <w:p>
@@ -2467,7 +2561,24 @@
           <w:sz w:val="20"/>
           <w:szCs w:val="20"/>
         </w:rPr>
-        <w:t>Comunicar ao LOCADOR o surgimento de qualquer dano ou defeito cuja reparação a este incumba, bem como as eventuais turbações de terceiros;</w:t>
+        <w:t xml:space="preserve">Comunicar ao </w:t>
+      </w:r>
+      <w:r>
+        <w:rPr>
+          <w:rFonts w:ascii="Arial" w:hAnsi="Arial" w:cs="Arial"/>
+          <w:sz w:val="20"/>
+          <w:szCs w:val="20"/>
+          <w:b/>
+        </w:rPr>
+        <w:t xml:space="preserve">LOCADOR</w:t>
+      </w:r>
+      <w:r>
+        <w:rPr>
+          <w:rFonts w:ascii="Arial" w:hAnsi="Arial" w:cs="Arial"/>
+          <w:sz w:val="20"/>
+          <w:szCs w:val="20"/>
+        </w:rPr>
+        <w:t xml:space="preserve"> o surgimento de qualquer dano ou defeito cuja reparação a este incumba, bem como as eventuais turbações de terceiros;</w:t>
       </w:r>
     </w:p>
     <w:p>
@@ -2502,7 +2613,41 @@
           <w:sz w:val="20"/>
           <w:szCs w:val="20"/>
         </w:rPr>
-        <w:t>Entregar imediatamente ao LOCADOR os documentos de cobrança de tributos e encargos condominiais, cujo pagamento não seja de seu encargo, bem como qualquer intimação, multa ou exigência de autoridade pública, ainda que direcionada ao LOCATÁRIO;</w:t>
+        <w:t xml:space="preserve">Entregar imediatamente ao </w:t>
+      </w:r>
+      <w:r>
+        <w:rPr>
+          <w:rFonts w:ascii="Arial" w:hAnsi="Arial" w:cs="Arial"/>
+          <w:sz w:val="20"/>
+          <w:szCs w:val="20"/>
+          <w:b/>
+        </w:rPr>
+        <w:t xml:space="preserve">LOCADOR</w:t>
+      </w:r>
+      <w:r>
+        <w:rPr>
+          <w:rFonts w:ascii="Arial" w:hAnsi="Arial" w:cs="Arial"/>
+          <w:sz w:val="20"/>
+          <w:szCs w:val="20"/>
+        </w:rPr>
+        <w:t xml:space="preserve"> os documentos de cobrança de tributos e encargos condominiais, cujo pagamento não seja de seu encargo, bem como qualquer intimação, multa ou exigência de autoridade pública, ainda que direcionada ao </w:t>
+      </w:r>
+      <w:r>
+        <w:rPr>
+          <w:rFonts w:ascii="Arial" w:hAnsi="Arial" w:cs="Arial"/>
+          <w:sz w:val="20"/>
+          <w:szCs w:val="20"/>
+          <w:b/>
+        </w:rPr>
+        <w:t xml:space="preserve">LOCATÁRIO</w:t>
+      </w:r>
+      <w:r>
+        <w:rPr>
+          <w:rFonts w:ascii="Arial" w:hAnsi="Arial" w:cs="Arial"/>
+          <w:sz w:val="20"/>
+          <w:szCs w:val="20"/>
+        </w:rPr>
+        <w:t xml:space="preserve">;</w:t>
       </w:r>
     </w:p>
     <w:p>
@@ -2574,7 +2719,24 @@
           <w:sz w:val="20"/>
           <w:szCs w:val="20"/>
         </w:rPr>
-        <w:t>Permitir a vistoria do imóvel pelo LOCADOR ou por seus mandatários, mediante prévia combinação de dia e hora, bem como admitir que seja visitado e examinado por terceiros, na hipótese de sua alienação, quando não possuir interesse no exercício do direito de preferência de aquisição (artigo 27 da Lei nº 8.245, de 1991);</w:t>
+        <w:t xml:space="preserve">Permitir a vistoria do imóvel pelo </w:t>
+      </w:r>
+      <w:r>
+        <w:rPr>
+          <w:rFonts w:ascii="Arial" w:hAnsi="Arial" w:cs="Arial"/>
+          <w:sz w:val="20"/>
+          <w:szCs w:val="20"/>
+          <w:b/>
+        </w:rPr>
+        <w:t xml:space="preserve">LOCADOR</w:t>
+      </w:r>
+      <w:r>
+        <w:rPr>
+          <w:rFonts w:ascii="Arial" w:hAnsi="Arial" w:cs="Arial"/>
+          <w:sz w:val="20"/>
+          <w:szCs w:val="20"/>
+        </w:rPr>
+        <w:t xml:space="preserve"> ou por seus mandatários, mediante prévia combinação de dia e hora, bem como admitir que seja visitado e examinado por terceiros, na hipótese de sua alienação, quando não possuir interesse no exercício do direito de preferência de aquisição (artigo 27 da Lei nº 8.245, de 1991);</w:t>
       </w:r>
     </w:p>
     <w:p>
@@ -2720,7 +2882,24 @@
           <w:sz w:val="20"/>
           <w:szCs w:val="20"/>
         </w:rPr>
-        <w:t xml:space="preserve">As benfeitorias voluptuárias serão indenizáveis caso haja prévia concordância do LOCADOR; </w:t>
+        <w:t xml:space="preserve">As benfeitorias voluptuárias serão indenizáveis caso haja prévia concordância do </w:t>
+      </w:r>
+      <w:r>
+        <w:rPr>
+          <w:rFonts w:ascii="Arial" w:hAnsi="Arial" w:cs="Arial"/>
+          <w:sz w:val="20"/>
+          <w:szCs w:val="20"/>
+          <w:b/>
+        </w:rPr>
+        <w:t xml:space="preserve">LOCADOR</w:t>
+      </w:r>
+      <w:r>
+        <w:rPr>
+          <w:rFonts w:ascii="Arial" w:hAnsi="Arial" w:cs="Arial"/>
+          <w:sz w:val="20"/>
+          <w:szCs w:val="20"/>
+        </w:rPr>
+        <w:t xml:space="preserve">; </w:t>
       </w:r>
     </w:p>
     <w:p>
@@ -2755,7 +2934,24 @@
           <w:sz w:val="20"/>
           <w:szCs w:val="20"/>
         </w:rPr>
-        <w:t>Caso não haja concordância da indenização, poderão ser levantadas pelo LOCATÁRIO, finda a locação, desde que sua retirada não afete a estrutura e a substância do imóvel</w:t>
+        <w:t xml:space="preserve">Caso não haja concordância da indenização, poderão ser levantadas pelo </w:t>
+      </w:r>
+      <w:r>
+        <w:rPr>
+          <w:rFonts w:ascii="Arial" w:hAnsi="Arial" w:cs="Arial"/>
+          <w:sz w:val="20"/>
+          <w:szCs w:val="20"/>
+          <w:b/>
+        </w:rPr>
+        <w:t xml:space="preserve">LOCATÁRIO</w:t>
+      </w:r>
+      <w:r>
+        <w:rPr>
+          <w:rFonts w:ascii="Arial" w:hAnsi="Arial" w:cs="Arial"/>
+          <w:sz w:val="20"/>
+          <w:szCs w:val="20"/>
+        </w:rPr>
+        <w:t xml:space="preserve">, finda a locação, desde que sua retirada não afete a estrutura e a substância do imóvel</w:t>
       </w:r>
       <w:r>
         <w:rPr>
@@ -2849,7 +3045,33 @@
           <w:sz w:val="20"/>
           <w:szCs w:val="20"/>
         </w:rPr>
-        <w:t>Caso as modificações ou adaptações feitas pelo LOCATÁRIO venham a causar algum dano ao imóvel durante o período de locação, este dano deve ser sanado a expensas do LOCATÁRIO</w:t>
+        <w:t xml:space="preserve">Caso as modificações ou adaptações feitas pelo </w:t>
+      </w:r>
+      <w:r>
+        <w:rPr>
+          <w:rFonts w:ascii="Arial" w:hAnsi="Arial" w:cs="Arial"/>
+          <w:sz w:val="20"/>
+          <w:szCs w:val="20"/>
+          <w:b/>
+        </w:rPr>
+        <w:t xml:space="preserve">LOCATÁRIO</w:t>
+      </w:r>
+      <w:r>
+        <w:rPr>
+          <w:rFonts w:ascii="Arial" w:hAnsi="Arial" w:cs="Arial"/>
+          <w:sz w:val="20"/>
+          <w:szCs w:val="20"/>
+        </w:rPr>
+        <w:t xml:space="preserve"> venham a causar algum dano ao imóvel durante o período de locação, este dano deve ser sanado a expensas do </w:t>
+      </w:r>
+      <w:r>
+        <w:rPr>
+          <w:rFonts w:ascii="Arial" w:hAnsi="Arial" w:cs="Arial"/>
+          <w:sz w:val="20"/>
+          <w:szCs w:val="20"/>
+          <w:b/>
+        </w:rPr>
+        <w:t xml:space="preserve">LOCATÁRIO</w:t>
       </w:r>
       <w:r>
         <w:rPr>
@@ -2892,7 +3114,41 @@
           <w:sz w:val="20"/>
           <w:szCs w:val="20"/>
         </w:rPr>
-        <w:t xml:space="preserve">Finda a locação, será o imóvel devolvido ao LOCADOR, nas condições em que foi recebido pelo LOCATÁRIO, </w:t>
+        <w:t xml:space="preserve">Finda a locação, será o imóvel devolvido ao </w:t>
+      </w:r>
+      <w:r>
+        <w:rPr>
+          <w:rFonts w:ascii="Arial" w:hAnsi="Arial" w:cs="Arial"/>
+          <w:sz w:val="20"/>
+          <w:szCs w:val="20"/>
+          <w:b/>
+        </w:rPr>
+        <w:t xml:space="preserve">LOCADOR</w:t>
+      </w:r>
+      <w:r>
+        <w:rPr>
+          <w:rFonts w:ascii="Arial" w:hAnsi="Arial" w:cs="Arial"/>
+          <w:sz w:val="20"/>
+          <w:szCs w:val="20"/>
+        </w:rPr>
+        <w:t xml:space="preserve">, nas condições em que foi recebido pelo </w:t>
+      </w:r>
+      <w:r>
+        <w:rPr>
+          <w:rFonts w:ascii="Arial" w:hAnsi="Arial" w:cs="Arial"/>
+          <w:sz w:val="20"/>
+          <w:szCs w:val="20"/>
+          <w:b/>
+        </w:rPr>
+        <w:t xml:space="preserve">LOCATÁRIO</w:t>
+      </w:r>
+      <w:r>
+        <w:rPr>
+          <w:rFonts w:ascii="Arial" w:hAnsi="Arial" w:cs="Arial"/>
+          <w:sz w:val="20"/>
+          <w:szCs w:val="20"/>
+        </w:rPr>
+        <w:t xml:space="preserve">, </w:t>
       </w:r>
       <w:r>
         <w:rPr>
@@ -3112,7 +3368,41 @@
           <w:sz w:val="20"/>
           <w:szCs w:val="20"/>
         </w:rPr>
-        <w:t>A prorrogação do prazo de vigência dependerá da comprovação pelo LOCATÁRIO de que o imóvel satisfaz os interesses estatais, da compatibilidade do valor de mercado e da anuência expressa do LOCADOR, mediante assinatura do termo aditivo</w:t>
+        <w:t xml:space="preserve">A prorrogação do prazo de vigência dependerá da comprovação pelo </w:t>
+      </w:r>
+      <w:r>
+        <w:rPr>
+          <w:rFonts w:ascii="Arial" w:hAnsi="Arial" w:cs="Arial"/>
+          <w:sz w:val="20"/>
+          <w:szCs w:val="20"/>
+          <w:b/>
+        </w:rPr>
+        <w:t xml:space="preserve">LOCATÁRIO</w:t>
+      </w:r>
+      <w:r>
+        <w:rPr>
+          <w:rFonts w:ascii="Arial" w:hAnsi="Arial" w:cs="Arial"/>
+          <w:sz w:val="20"/>
+          <w:szCs w:val="20"/>
+        </w:rPr>
+        <w:t xml:space="preserve"> de que o imóvel satisfaz os interesses estatais, da compatibilidade do valor de mercado e da anuência expressa do </w:t>
+      </w:r>
+      <w:r>
+        <w:rPr>
+          <w:rFonts w:ascii="Arial" w:hAnsi="Arial" w:cs="Arial"/>
+          <w:sz w:val="20"/>
+          <w:szCs w:val="20"/>
+          <w:b/>
+        </w:rPr>
+        <w:t xml:space="preserve">LOCADOR</w:t>
+      </w:r>
+      <w:r>
+        <w:rPr>
+          <w:rFonts w:ascii="Arial" w:hAnsi="Arial" w:cs="Arial"/>
+          <w:sz w:val="20"/>
+          <w:szCs w:val="20"/>
+        </w:rPr>
+        <w:t xml:space="preserve">, mediante assinatura do termo aditivo</w:t>
       </w:r>
       <w:r>
         <w:rPr>
@@ -3165,7 +3455,41 @@
           <w:sz w:val="20"/>
           <w:szCs w:val="20"/>
         </w:rPr>
-        <w:t xml:space="preserve">Caso não tenha interesse na prorrogação, o LOCADOR deverá enviar comunicação escrita ao LOCATÁRIO, com antecedência mínima de </w:t>
+        <w:t xml:space="preserve">Caso não tenha interesse na prorrogação, o </w:t>
+      </w:r>
+      <w:r>
+        <w:rPr>
+          <w:rFonts w:ascii="Arial" w:hAnsi="Arial" w:cs="Arial"/>
+          <w:sz w:val="20"/>
+          <w:szCs w:val="20"/>
+          <w:b/>
+        </w:rPr>
+        <w:t xml:space="preserve">LOCADOR</w:t>
+      </w:r>
+      <w:r>
+        <w:rPr>
+          <w:rFonts w:ascii="Arial" w:hAnsi="Arial" w:cs="Arial"/>
+          <w:sz w:val="20"/>
+          <w:szCs w:val="20"/>
+        </w:rPr>
+        <w:t xml:space="preserve"> deverá enviar comunicação escrita ao </w:t>
+      </w:r>
+      <w:r>
+        <w:rPr>
+          <w:rFonts w:ascii="Arial" w:hAnsi="Arial" w:cs="Arial"/>
+          <w:sz w:val="20"/>
+          <w:szCs w:val="20"/>
+          <w:b/>
+        </w:rPr>
+        <w:t xml:space="preserve">LOCATÁRIO</w:t>
+      </w:r>
+      <w:r>
+        <w:rPr>
+          <w:rFonts w:ascii="Arial" w:hAnsi="Arial" w:cs="Arial"/>
+          <w:sz w:val="20"/>
+          <w:szCs w:val="20"/>
+        </w:rPr>
+        <w:t xml:space="preserve">, com antecedência mínima de </w:t>
       </w:r>
       <w:r>
         <w:rPr>
@@ -3242,7 +3566,24 @@
           <w:sz w:val="20"/>
           <w:szCs w:val="20"/>
         </w:rPr>
-        <w:t xml:space="preserve">6.1 - O MUNICÍPIO pagará ao LOCADOR o aluguel mensal no valor de R$ </w:t>
+        <w:t xml:space="preserve">6.1 - O MUNICÍPIO pagará ao </w:t>
+      </w:r>
+      <w:r>
+        <w:rPr>
+          <w:rFonts w:ascii="Arial" w:hAnsi="Arial" w:cs="Arial"/>
+          <w:sz w:val="20"/>
+          <w:szCs w:val="20"/>
+          <w:b/>
+        </w:rPr>
+        <w:t xml:space="preserve">LOCADOR</w:t>
+      </w:r>
+      <w:r>
+        <w:rPr>
+          <w:rFonts w:ascii="Arial" w:hAnsi="Arial" w:cs="Arial"/>
+          <w:sz w:val="20"/>
+          <w:szCs w:val="20"/>
+        </w:rPr>
+        <w:t xml:space="preserve"> o aluguel mensal no valor de R$ </w:t>
       </w:r>
       <w:r>
         <w:rPr>
@@ -3462,7 +3803,24 @@
           <w:sz w:val="20"/>
           <w:szCs w:val="20"/>
         </w:rPr>
-        <w:t>As despesas ordinárias do condomínio, bem como os encargos locatícios incidentes sobre o imóvel (água e esgoto, energia elétrica etc.), cujo pagamento tenha sido atribuído contratualmente ao LOCATÁRIO, serão suportadas proporcionalmente, em regime de rateio, a partir da data da efetiva ocupação do imóvel</w:t>
+        <w:t xml:space="preserve">As despesas ordinárias do condomínio, bem como os encargos locatícios incidentes sobre o imóvel (água e esgoto, energia elétrica etc.), cujo pagamento tenha sido atribuído contratualmente ao </w:t>
+      </w:r>
+      <w:r>
+        <w:rPr>
+          <w:rFonts w:ascii="Arial" w:hAnsi="Arial" w:cs="Arial"/>
+          <w:sz w:val="20"/>
+          <w:szCs w:val="20"/>
+          <w:b/>
+        </w:rPr>
+        <w:t xml:space="preserve">LOCATÁRIO</w:t>
+      </w:r>
+      <w:r>
+        <w:rPr>
+          <w:rFonts w:ascii="Arial" w:hAnsi="Arial" w:cs="Arial"/>
+          <w:sz w:val="20"/>
+          <w:szCs w:val="20"/>
+        </w:rPr>
+        <w:t xml:space="preserve">, serão suportadas proporcionalmente, em regime de rateio, a partir da data da efetiva ocupação do imóvel</w:t>
       </w:r>
       <w:r>
         <w:rPr>
@@ -3506,7 +3864,75 @@
           <w:sz w:val="20"/>
           <w:szCs w:val="20"/>
         </w:rPr>
-        <w:t>O acertamento desta proporção se dará na primeira parcela vencível da despesa, pagando LOCADOR e LOCATÁRIO suas respectivas partes da parcela. Caso o LOCATÁRIO a pague na integralidade, a parte de responsabilidade do LOCADOR será abatida no valor do aluguel do mês subsequente. A mesma proporção também será observada no encerramento do contrato, promovendo-se o acertamento preferencialmente no pagamento do último aluguel</w:t>
+        <w:t xml:space="preserve">O acertamento desta proporção se dará na primeira parcela vencível da despesa, pagando </w:t>
+      </w:r>
+      <w:r>
+        <w:rPr>
+          <w:rFonts w:ascii="Arial" w:hAnsi="Arial" w:cs="Arial"/>
+          <w:sz w:val="20"/>
+          <w:szCs w:val="20"/>
+          <w:b/>
+        </w:rPr>
+        <w:t xml:space="preserve">LOCADOR</w:t>
+      </w:r>
+      <w:r>
+        <w:rPr>
+          <w:rFonts w:ascii="Arial" w:hAnsi="Arial" w:cs="Arial"/>
+          <w:sz w:val="20"/>
+          <w:szCs w:val="20"/>
+        </w:rPr>
+        <w:t xml:space="preserve"> e </w:t>
+      </w:r>
+      <w:r>
+        <w:rPr>
+          <w:rFonts w:ascii="Arial" w:hAnsi="Arial" w:cs="Arial"/>
+          <w:sz w:val="20"/>
+          <w:szCs w:val="20"/>
+          <w:b/>
+        </w:rPr>
+        <w:t xml:space="preserve">LOCATÁRIO</w:t>
+      </w:r>
+      <w:r>
+        <w:rPr>
+          <w:rFonts w:ascii="Arial" w:hAnsi="Arial" w:cs="Arial"/>
+          <w:sz w:val="20"/>
+          <w:szCs w:val="20"/>
+        </w:rPr>
+        <w:t xml:space="preserve"> suas respectivas partes da parcela. Caso o </w:t>
+      </w:r>
+      <w:r>
+        <w:rPr>
+          <w:rFonts w:ascii="Arial" w:hAnsi="Arial" w:cs="Arial"/>
+          <w:sz w:val="20"/>
+          <w:szCs w:val="20"/>
+          <w:b/>
+        </w:rPr>
+        <w:t xml:space="preserve">LOCATÁRIO</w:t>
+      </w:r>
+      <w:r>
+        <w:rPr>
+          <w:rFonts w:ascii="Arial" w:hAnsi="Arial" w:cs="Arial"/>
+          <w:sz w:val="20"/>
+          <w:szCs w:val="20"/>
+        </w:rPr>
+        <w:t xml:space="preserve"> a pague na integralidade, a parte de responsabilidade do </w:t>
+      </w:r>
+      <w:r>
+        <w:rPr>
+          <w:rFonts w:ascii="Arial" w:hAnsi="Arial" w:cs="Arial"/>
+          <w:sz w:val="20"/>
+          <w:szCs w:val="20"/>
+          <w:b/>
+        </w:rPr>
+        <w:t xml:space="preserve">LOCADOR</w:t>
+      </w:r>
+      <w:r>
+        <w:rPr>
+          <w:rFonts w:ascii="Arial" w:hAnsi="Arial" w:cs="Arial"/>
+          <w:sz w:val="20"/>
+          <w:szCs w:val="20"/>
+        </w:rPr>
+        <w:t xml:space="preserve"> será abatida no valor do aluguel do mês subsequente. A mesma proporção também será observada no encerramento do contrato, promovendo-se o acertamento preferencialmente no pagamento do último aluguel</w:t>
       </w:r>
       <w:r>
         <w:rPr>
@@ -3549,7 +3975,41 @@
           <w:sz w:val="20"/>
           <w:szCs w:val="20"/>
         </w:rPr>
-        <w:t>O LOCATÁRIO não se responsabilizará por qualquer despesa que venha a ser efetuada pelo LOCADOR, que porventura não tenha sido acordada no contrato.</w:t>
+        <w:t xml:space="preserve">O </w:t>
+      </w:r>
+      <w:r>
+        <w:rPr>
+          <w:rFonts w:ascii="Arial" w:hAnsi="Arial" w:cs="Arial"/>
+          <w:sz w:val="20"/>
+          <w:szCs w:val="20"/>
+          <w:b/>
+        </w:rPr>
+        <w:t xml:space="preserve">LOCATÁRIO</w:t>
+      </w:r>
+      <w:r>
+        <w:rPr>
+          <w:rFonts w:ascii="Arial" w:hAnsi="Arial" w:cs="Arial"/>
+          <w:sz w:val="20"/>
+          <w:szCs w:val="20"/>
+        </w:rPr>
+        <w:t xml:space="preserve"> não se responsabilizará por qualquer despesa que venha a ser efetuada pelo </w:t>
+      </w:r>
+      <w:r>
+        <w:rPr>
+          <w:rFonts w:ascii="Arial" w:hAnsi="Arial" w:cs="Arial"/>
+          <w:sz w:val="20"/>
+          <w:szCs w:val="20"/>
+          <w:b/>
+        </w:rPr>
+        <w:t xml:space="preserve">LOCADOR</w:t>
+      </w:r>
+      <w:r>
+        <w:rPr>
+          <w:rFonts w:ascii="Arial" w:hAnsi="Arial" w:cs="Arial"/>
+          <w:sz w:val="20"/>
+          <w:szCs w:val="20"/>
+        </w:rPr>
+        <w:t xml:space="preserve">, que porventura não tenha sido acordada no contrato.</w:t>
       </w:r>
     </w:p>
     <w:p>
@@ -3894,7 +4354,41 @@
           <w:sz w:val="20"/>
           <w:szCs w:val="20"/>
         </w:rPr>
-        <w:t>A fiscalização de que trata esta cláusula não exclui nem reduz a responsabilidade do LOCADOR, inclusive perante terceiros, por qualquer irregularidade, ainda que resultante de imperfeições técnicas, vícios redibitórios, ou emprego de material inadequado ou de qualidade inferior e, na ocorrência desta, não implica em corresponsabilidade do LOCATÁRIO ou de seus agentes e prepostos.</w:t>
+        <w:t xml:space="preserve">A fiscalização de que trata esta cláusula não exclui nem reduz a responsabilidade do </w:t>
+      </w:r>
+      <w:r>
+        <w:rPr>
+          <w:rFonts w:ascii="Arial" w:hAnsi="Arial" w:cs="Arial"/>
+          <w:sz w:val="20"/>
+          <w:szCs w:val="20"/>
+          <w:b/>
+        </w:rPr>
+        <w:t xml:space="preserve">LOCADOR</w:t>
+      </w:r>
+      <w:r>
+        <w:rPr>
+          <w:rFonts w:ascii="Arial" w:hAnsi="Arial" w:cs="Arial"/>
+          <w:sz w:val="20"/>
+          <w:szCs w:val="20"/>
+        </w:rPr>
+        <w:t xml:space="preserve">, inclusive perante terceiros, por qualquer irregularidade, ainda que resultante de imperfeições técnicas, vícios redibitórios, ou emprego de material inadequado ou de qualidade inferior e, na ocorrência desta, não implica em corresponsabilidade do </w:t>
+      </w:r>
+      <w:r>
+        <w:rPr>
+          <w:rFonts w:ascii="Arial" w:hAnsi="Arial" w:cs="Arial"/>
+          <w:sz w:val="20"/>
+          <w:szCs w:val="20"/>
+          <w:b/>
+        </w:rPr>
+        <w:t xml:space="preserve">LOCATÁRIO</w:t>
+      </w:r>
+      <w:r>
+        <w:rPr>
+          <w:rFonts w:ascii="Arial" w:hAnsi="Arial" w:cs="Arial"/>
+          <w:sz w:val="20"/>
+          <w:szCs w:val="20"/>
+        </w:rPr>
+        <w:t xml:space="preserve"> ou de seus agentes e prepostos.</w:t>
       </w:r>
     </w:p>
     <w:p>
@@ -3970,7 +4464,24 @@
           <w:sz w:val="20"/>
           <w:szCs w:val="20"/>
         </w:rPr>
-        <w:t>9.1.5. O LOCADOR poderá indicar um representante para representá-lo na execução do contrato.</w:t>
+        <w:t xml:space="preserve">9.1.5. O </w:t>
+      </w:r>
+      <w:r>
+        <w:rPr>
+          <w:rFonts w:ascii="Arial" w:hAnsi="Arial" w:cs="Arial"/>
+          <w:sz w:val="20"/>
+          <w:szCs w:val="20"/>
+          <w:b/>
+        </w:rPr>
+        <w:t xml:space="preserve">LOCADOR</w:t>
+      </w:r>
+      <w:r>
+        <w:rPr>
+          <w:rFonts w:ascii="Arial" w:hAnsi="Arial" w:cs="Arial"/>
+          <w:sz w:val="20"/>
+          <w:szCs w:val="20"/>
+        </w:rPr>
+        <w:t xml:space="preserve"> poderá indicar um representante para representá-lo na execução do contrato.</w:t>
       </w:r>
     </w:p>
     <w:p>
@@ -4040,7 +4551,24 @@
           <w:sz w:val="20"/>
           <w:szCs w:val="20"/>
         </w:rPr>
-        <w:t>A inexecução total ou parcial do contrato, ou o descumprimento de qualquer dos deveres elencados no contrato, sujeitará o LOCADOR, garantidos o contraditório e a ampla defesa, sem prejuízo da responsabilidade civil e criminal e nos moldes da Lei 14.133/2021, às penalidades de:</w:t>
+        <w:t xml:space="preserve">A inexecução total ou parcial do contrato, ou o descumprimento de qualquer dos deveres elencados no contrato, sujeitará o </w:t>
+      </w:r>
+      <w:r>
+        <w:rPr>
+          <w:rFonts w:ascii="Arial" w:hAnsi="Arial" w:cs="Arial"/>
+          <w:sz w:val="20"/>
+          <w:szCs w:val="20"/>
+          <w:b/>
+        </w:rPr>
+        <w:t xml:space="preserve">LOCADOR</w:t>
+      </w:r>
+      <w:r>
+        <w:rPr>
+          <w:rFonts w:ascii="Arial" w:hAnsi="Arial" w:cs="Arial"/>
+          <w:sz w:val="20"/>
+          <w:szCs w:val="20"/>
+        </w:rPr>
+        <w:t xml:space="preserve">, garantidos o contraditório e a ampla defesa, sem prejuízo da responsabilidade civil e criminal e nos moldes da Lei 14.133/2021, às penalidades de:</w:t>
       </w:r>
     </w:p>
     <w:p>
@@ -4607,7 +5135,24 @@
           <w:sz w:val="20"/>
           <w:szCs w:val="20"/>
         </w:rPr>
-        <w:t>. o LOCADOR apresentar declaração ou documentação falsa para a celebração do contrato ou em sua execução;</w:t>
+        <w:t xml:space="preserve">. o </w:t>
+      </w:r>
+      <w:r>
+        <w:rPr>
+          <w:rFonts w:ascii="Arial" w:hAnsi="Arial" w:cs="Arial"/>
+          <w:sz w:val="20"/>
+          <w:szCs w:val="20"/>
+          <w:b/>
+        </w:rPr>
+        <w:t xml:space="preserve">LOCADOR</w:t>
+      </w:r>
+      <w:r>
+        <w:rPr>
+          <w:rFonts w:ascii="Arial" w:hAnsi="Arial" w:cs="Arial"/>
+          <w:sz w:val="20"/>
+          <w:szCs w:val="20"/>
+        </w:rPr>
+        <w:t xml:space="preserve"> apresentar declaração ou documentação falsa para a celebração do contrato ou em sua execução;</w:t>
       </w:r>
     </w:p>
     <w:p>
@@ -4638,7 +5183,24 @@
           <w:sz w:val="20"/>
           <w:szCs w:val="20"/>
         </w:rPr>
-        <w:t>. o LOCADOR fraudar a ou praticar ato fraudulento na execução do contrato;</w:t>
+        <w:t xml:space="preserve">. o </w:t>
+      </w:r>
+      <w:r>
+        <w:rPr>
+          <w:rFonts w:ascii="Arial" w:hAnsi="Arial" w:cs="Arial"/>
+          <w:sz w:val="20"/>
+          <w:szCs w:val="20"/>
+          <w:b/>
+        </w:rPr>
+        <w:t xml:space="preserve">LOCADOR</w:t>
+      </w:r>
+      <w:r>
+        <w:rPr>
+          <w:rFonts w:ascii="Arial" w:hAnsi="Arial" w:cs="Arial"/>
+          <w:sz w:val="20"/>
+          <w:szCs w:val="20"/>
+        </w:rPr>
+        <w:t xml:space="preserve"> fraudar a ou praticar ato fraudulento na execução do contrato;</w:t>
       </w:r>
     </w:p>
     <w:p>
@@ -5081,7 +5643,24 @@
           <w:sz w:val="20"/>
           <w:szCs w:val="20"/>
         </w:rPr>
-        <w:t xml:space="preserve"> As multas devidas e/ou prejuízos causados ao LOCATÁRIO serão deduzidos dos valores a serem pagos, ou recolhidos em favor do Município, ou ainda, quando for o caso, serão inscritos na Dívida Ativa do Município e cobrados judicialmente</w:t>
+        <w:t xml:space="preserve"> As multas devidas e/ou prejuízos causados ao </w:t>
+      </w:r>
+      <w:r>
+        <w:rPr>
+          <w:rFonts w:ascii="Arial" w:hAnsi="Arial" w:cs="Arial"/>
+          <w:sz w:val="20"/>
+          <w:szCs w:val="20"/>
+          <w:b/>
+        </w:rPr>
+        <w:t xml:space="preserve">LOCATÁRIO</w:t>
+      </w:r>
+      <w:r>
+        <w:rPr>
+          <w:rFonts w:ascii="Arial" w:hAnsi="Arial" w:cs="Arial"/>
+          <w:sz w:val="20"/>
+          <w:szCs w:val="20"/>
+        </w:rPr>
+        <w:t xml:space="preserve"> serão deduzidos dos valores a serem pagos, ou recolhidos em favor do Município, ou ainda, quando for o caso, serão inscritos na Dívida Ativa do Município e cobrados judicialmente</w:t>
       </w:r>
       <w:r>
         <w:rPr>
@@ -5205,7 +5784,7 @@
           <w:sz w:val="20"/>
           <w:szCs w:val="20"/>
         </w:rPr>
-        <w:t xml:space="preserve"> Este contrato poderá ser alterado, mediante Termo Aditivo, para melhor adequação ao atendimento da finalidade de interesse público a que se destina e para os casos previstos neste instrumento, sendo assegurada ao LOCADOR a manutenção do equilíbrio econômico-financeiro do ajuste</w:t>
+        <w:t xml:space="preserve"> Este contrato poderá ser alterado, mediante Termo Aditivo, para melhor adequação ao atendimento da finalidade de interesse público a que se destina e para os casos previstos neste instrumento, sendo assegurada ao </w:t>
       </w:r>
       <w:r>
         <w:rPr>
@@ -5213,6 +5792,25 @@
           <w:bCs/>
           <w:sz w:val="20"/>
           <w:szCs w:val="20"/>
+          <w:b/>
+        </w:rPr>
+        <w:t xml:space="preserve">LOCADOR</w:t>
+      </w:r>
+      <w:r>
+        <w:rPr>
+          <w:rFonts w:ascii="Arial" w:hAnsi="Arial" w:cs="Arial"/>
+          <w:bCs/>
+          <w:sz w:val="20"/>
+          <w:szCs w:val="20"/>
+        </w:rPr>
+        <w:t xml:space="preserve"> a manutenção do equilíbrio econômico-financeiro do ajuste</w:t>
+      </w:r>
+      <w:r>
+        <w:rPr>
+          <w:rFonts w:ascii="Arial" w:hAnsi="Arial" w:cs="Arial"/>
+          <w:bCs/>
+          <w:sz w:val="20"/>
+          <w:szCs w:val="20"/>
         </w:rPr>
         <w:t>;</w:t>
       </w:r>
@@ -5301,7 +5899,26 @@
           <w:sz w:val="20"/>
           <w:szCs w:val="20"/>
         </w:rPr>
-        <w:t xml:space="preserve"> Se, durante a locação, a coisa locada se deteriorar, sem culpa do LOCATÁRIO e o imóvel ainda servir para o fim a que se disponha, a este caberá pedir redução proporcional do valor da locação;</w:t>
+        <w:t xml:space="preserve"> Se, durante a locação, a coisa locada se deteriorar, sem culpa do </w:t>
+      </w:r>
+      <w:r>
+        <w:rPr>
+          <w:rFonts w:ascii="Arial" w:hAnsi="Arial" w:cs="Arial"/>
+          <w:bCs/>
+          <w:sz w:val="20"/>
+          <w:szCs w:val="20"/>
+          <w:b/>
+        </w:rPr>
+        <w:t xml:space="preserve">LOCATÁRIO</w:t>
+      </w:r>
+      <w:r>
+        <w:rPr>
+          <w:rFonts w:ascii="Arial" w:hAnsi="Arial" w:cs="Arial"/>
+          <w:bCs/>
+          <w:sz w:val="20"/>
+          <w:szCs w:val="20"/>
+        </w:rPr>
+        <w:t xml:space="preserve"> e o imóvel ainda servir para o fim a que se disponha, a este caberá pedir redução proporcional do valor da locação;</w:t>
       </w:r>
     </w:p>
     <w:p>
@@ -5340,7 +5957,7 @@
           <w:sz w:val="20"/>
           <w:szCs w:val="20"/>
         </w:rPr>
-        <w:t xml:space="preserve"> Durante o prazo estipulado para a duração do contrato, não poderá o LOCADOR reaver o imóvel locado (art. 4º da Lei Federal n. 8.245/1991)</w:t>
+        <w:t xml:space="preserve"> Durante o prazo estipulado para a duração do contrato, não poderá o </w:t>
       </w:r>
       <w:r>
         <w:rPr>
@@ -5348,6 +5965,25 @@
           <w:bCs/>
           <w:sz w:val="20"/>
           <w:szCs w:val="20"/>
+          <w:b/>
+        </w:rPr>
+        <w:t xml:space="preserve">LOCADOR</w:t>
+      </w:r>
+      <w:r>
+        <w:rPr>
+          <w:rFonts w:ascii="Arial" w:hAnsi="Arial" w:cs="Arial"/>
+          <w:bCs/>
+          <w:sz w:val="20"/>
+          <w:szCs w:val="20"/>
+        </w:rPr>
+        <w:t xml:space="preserve"> reaver o imóvel locado (art. 4º da Lei Federal n. 8.245/1991)</w:t>
+      </w:r>
+      <w:r>
+        <w:rPr>
+          <w:rFonts w:ascii="Arial" w:hAnsi="Arial" w:cs="Arial"/>
+          <w:bCs/>
+          <w:sz w:val="20"/>
+          <w:szCs w:val="20"/>
         </w:rPr>
         <w:t>.</w:t>
       </w:r>
@@ -5416,7 +6052,41 @@
           <w:sz w:val="20"/>
           <w:szCs w:val="20"/>
         </w:rPr>
-        <w:t>O LOCATÁRIO, no seu lídimo interesse, poderá extinguir este contrato, sem qualquer ônus, em caso de descumprimento total ou parcial de qualquer cláusula contratual ou obrigação imposta ao LOCADOR, sem prejuízo da aplicação das penalidades cabíveis</w:t>
+        <w:t xml:space="preserve">O </w:t>
+      </w:r>
+      <w:r>
+        <w:rPr>
+          <w:rFonts w:ascii="Arial" w:hAnsi="Arial" w:cs="Arial"/>
+          <w:sz w:val="20"/>
+          <w:szCs w:val="20"/>
+          <w:b/>
+        </w:rPr>
+        <w:t xml:space="preserve">LOCATÁRIO</w:t>
+      </w:r>
+      <w:r>
+        <w:rPr>
+          <w:rFonts w:ascii="Arial" w:hAnsi="Arial" w:cs="Arial"/>
+          <w:sz w:val="20"/>
+          <w:szCs w:val="20"/>
+        </w:rPr>
+        <w:t xml:space="preserve">, no seu lídimo interesse, poderá extinguir este contrato, sem qualquer ônus, em caso de descumprimento total ou parcial de qualquer cláusula contratual ou obrigação imposta ao </w:t>
+      </w:r>
+      <w:r>
+        <w:rPr>
+          <w:rFonts w:ascii="Arial" w:hAnsi="Arial" w:cs="Arial"/>
+          <w:sz w:val="20"/>
+          <w:szCs w:val="20"/>
+          <w:b/>
+        </w:rPr>
+        <w:t xml:space="preserve">LOCADOR</w:t>
+      </w:r>
+      <w:r>
+        <w:rPr>
+          <w:rFonts w:ascii="Arial" w:hAnsi="Arial" w:cs="Arial"/>
+          <w:sz w:val="20"/>
+          <w:szCs w:val="20"/>
+        </w:rPr>
+        <w:t xml:space="preserve">, sem prejuízo da aplicação das penalidades cabíveis</w:t>
       </w:r>
       <w:r>
         <w:rPr>
@@ -5459,12 +6129,29 @@
           <w:sz w:val="20"/>
           <w:szCs w:val="20"/>
         </w:rPr>
-        <w:t xml:space="preserve">A extinção por descumprimento das cláusulas e obrigações contratuais acarretará a execução dos valores das multas e indenizações devidos ao LOCATÁRIO, bem como </w:t>
-      </w:r>
-      <w:r>
-        <w:rPr>
-          <w:rFonts w:ascii="Arial" w:hAnsi="Arial" w:cs="Arial"/>
+        <w:t xml:space="preserve">A extinção por descumprimento das cláusulas e obrigações contratuais acarretará a execução dos valores das multas e indenizações devidos ao </w:t>
+      </w:r>
+      <w:r>
+        <w:rPr>
+          <w:rFonts w:ascii="Arial" w:hAnsi="Arial" w:cs="Arial"/>
+          <w:sz w:val="20"/>
+          <w:szCs w:val="20"/>
           <w:b/>
+        </w:rPr>
+        <w:t xml:space="preserve">LOCATÁRIO</w:t>
+      </w:r>
+      <w:r>
+        <w:rPr>
+          <w:rFonts w:ascii="Arial" w:hAnsi="Arial" w:cs="Arial"/>
+          <w:sz w:val="20"/>
+          <w:szCs w:val="20"/>
+        </w:rPr>
+        <w:t xml:space="preserve">, bem como </w:t>
+      </w:r>
+      <w:r>
+        <w:rPr>
+          <w:rFonts w:ascii="Arial" w:hAnsi="Arial" w:cs="Arial"/>
+          <w:b/>
           <w:sz w:val="20"/>
           <w:szCs w:val="20"/>
         </w:rPr>
@@ -5572,7 +6259,26 @@
           <w:sz w:val="20"/>
           <w:szCs w:val="20"/>
         </w:rPr>
-        <w:t>o LOCATÁRIO poderá considerar o contrato rescindido imediatamente, ficando dispensada de qualquer prévia notificação, ou multa, desde que, nesta hipótese, não tenha concorrido para a situação</w:t>
+        <w:t xml:space="preserve">o </w:t>
+      </w:r>
+      <w:r>
+        <w:rPr>
+          <w:rFonts w:ascii="Arial" w:hAnsi="Arial" w:cs="Arial"/>
+          <w:bCs/>
+          <w:sz w:val="20"/>
+          <w:szCs w:val="20"/>
+          <w:b/>
+        </w:rPr>
+        <w:t xml:space="preserve">LOCATÁRIO</w:t>
+      </w:r>
+      <w:r>
+        <w:rPr>
+          <w:rFonts w:ascii="Arial" w:hAnsi="Arial" w:cs="Arial"/>
+          <w:bCs/>
+          <w:sz w:val="20"/>
+          <w:szCs w:val="20"/>
+        </w:rPr>
+        <w:t xml:space="preserve"> poderá considerar o contrato rescindido imediatamente, ficando dispensada de qualquer prévia notificação, ou multa, desde que, nesta hipótese, não tenha concorrido para a situação</w:t>
       </w:r>
       <w:r>
         <w:rPr>
@@ -5851,7 +6557,24 @@
           <w:sz w:val="20"/>
           <w:szCs w:val="20"/>
         </w:rPr>
-        <w:t xml:space="preserve">Caberá ao LOCATÁRIO providenciar, por sua conta, a publicação resumida do Contrato no Portal Nacional de Contratações Públicas (PNCP), que é condição indispensável para a sua eficácia, conforme preceitua o art. 94 da Lei 14.133/2021. </w:t>
+        <w:t xml:space="preserve">Caberá ao </w:t>
+      </w:r>
+      <w:r>
+        <w:rPr>
+          <w:rFonts w:ascii="Arial" w:hAnsi="Arial" w:cs="Arial"/>
+          <w:sz w:val="20"/>
+          <w:szCs w:val="20"/>
+          <w:b/>
+        </w:rPr>
+        <w:t xml:space="preserve">LOCATÁRIO</w:t>
+      </w:r>
+      <w:r>
+        <w:rPr>
+          <w:rFonts w:ascii="Arial" w:hAnsi="Arial" w:cs="Arial"/>
+          <w:sz w:val="20"/>
+          <w:szCs w:val="20"/>
+        </w:rPr>
+        <w:t xml:space="preserve"> providenciar, por sua conta, a publicação resumida do Contrato no Portal Nacional de Contratações Públicas (PNCP), que é condição indispensável para a sua eficácia, conforme preceitua o art. 94 da Lei 14.133/2021. </w:t>
       </w:r>
     </w:p>
     <w:p>
@@ -5926,7 +6649,24 @@
           <w:sz w:val="20"/>
           <w:szCs w:val="20"/>
         </w:rPr>
-        <w:t xml:space="preserve"> Os casos omissos ou situações não explicitadas nas cláusulas deste contrato serão decididos pelo LOCATÁRIO, segundo as disposições contidas na Lei nº 8.245, de 1991, e na Lei nº 14.133, de 2021, subsidiariamente, bem como nos demais atos normativos correlatos, que fazem parte integrante deste contrato, independentemente de suas transcrições</w:t>
+        <w:t xml:space="preserve"> Os casos omissos ou situações não explicitadas nas cláusulas deste contrato serão decididos pelo </w:t>
+      </w:r>
+      <w:r>
+        <w:rPr>
+          <w:rFonts w:ascii="Arial" w:hAnsi="Arial" w:cs="Arial"/>
+          <w:sz w:val="20"/>
+          <w:szCs w:val="20"/>
+          <w:b/>
+        </w:rPr>
+        <w:t xml:space="preserve">LOCATÁRIO</w:t>
+      </w:r>
+      <w:r>
+        <w:rPr>
+          <w:rFonts w:ascii="Arial" w:hAnsi="Arial" w:cs="Arial"/>
+          <w:sz w:val="20"/>
+          <w:szCs w:val="20"/>
+        </w:rPr>
+        <w:t xml:space="preserve">, segundo as disposições contidas na Lei nº 8.245, de 1991, e na Lei nº 14.133, de 2021, subsidiariamente, bem como nos demais atos normativos correlatos, que fazem parte integrante deste contrato, independentemente de suas transcrições</w:t>
       </w:r>
       <w:r>
         <w:rPr>
@@ -6270,12 +7010,12 @@
             <w:r>
               <w:rPr>
                 <w:rFonts w:ascii="Arial" w:hAnsi="Arial" w:cs="Arial"/>
-                <w:b/>
                 <w:bCs/>
                 <w:sz w:val="20"/>
                 <w:szCs w:val="20"/>
-              </w:rPr>
-              <w:t>CONTRATANTE</w:t>
+                <w:b/>
+              </w:rPr>
+              <w:t xml:space="preserve">LOCATÁRIO</w:t>
             </w:r>
           </w:p>
         </w:tc>
@@ -6319,12 +7059,12 @@
             <w:r>
               <w:rPr>
                 <w:rFonts w:ascii="Arial" w:hAnsi="Arial" w:cs="Arial"/>
-                <w:b/>
                 <w:bCs/>
                 <w:sz w:val="20"/>
                 <w:szCs w:val="20"/>
-              </w:rPr>
-              <w:t>CONTRATADA</w:t>
+                <w:b/>
+              </w:rPr>
+              <w:t xml:space="preserve">LOCADOR</w:t>
             </w:r>
           </w:p>
         </w:tc>
@@ -6515,50 +7255,7 @@
                 <w:sz w:val="20"/>
                 <w:szCs w:val="20"/>
               </w:rPr>
-              <w:t xml:space="preserve">Decreto </w:t>
-            </w:r>
-            <w:r>
-              <w:rPr>
-                <w:rFonts w:ascii="Arial" w:eastAsia="Arial" w:hAnsi="Arial" w:cs="Arial"/>
-                <w:sz w:val="20"/>
-                <w:szCs w:val="20"/>
-              </w:rPr>
-              <w:t xml:space="preserve">Municipal </w:t>
-            </w:r>
-            <w:r>
-              <w:rPr>
-                <w:rFonts w:ascii="Arial" w:eastAsia="Arial" w:hAnsi="Arial" w:cs="Arial"/>
-                <w:sz w:val="20"/>
-                <w:szCs w:val="20"/>
-              </w:rPr>
-              <w:t xml:space="preserve">nº </w:t>
-            </w:r>
-            <w:r>
-              <w:rPr>
-                <w:rFonts w:ascii="Arial" w:eastAsia="Arial" w:hAnsi="Arial" w:cs="Arial"/>
-                <w:sz w:val="20"/>
-                <w:szCs w:val="20"/>
-              </w:rPr>
-              <w:t>#Decreto</w:t>
-            </w:r>
-          </w:p>
-          <w:p>
-            <w:pPr>
-              <w:jc w:val="center"/>
-              <w:rPr>
-                <w:rFonts w:ascii="Arial" w:hAnsi="Arial" w:cs="Arial"/>
-                <w:sz w:val="20"/>
-                <w:szCs w:val="20"/>
-              </w:rPr>
-            </w:pPr>
-            <w:r>
-              <w:rPr>
-                <w:rFonts w:ascii="Arial" w:hAnsi="Arial" w:cs="Arial"/>
-                <w:bCs/>
-                <w:sz w:val="20"/>
-                <w:szCs w:val="20"/>
-              </w:rPr>
-              <w:t>#Cargo_Gestor</w:t>
+              <w:t>CPF: #CPF_GESTOR</w:t>
             </w:r>
           </w:p>
         </w:tc>
@@ -6628,7 +7325,7 @@
                 <w:sz w:val="20"/>
                 <w:szCs w:val="20"/>
               </w:rPr>
-              <w:t>#Dados_Locador</w:t>
+              <w:t>#DOCUMENTO_LOCADOR</w:t>
             </w:r>
           </w:p>
         </w:tc>

</xml_diff>